<commit_message>
2.12 ve 3.3: Gorsel C icin metin atfi eklendi; 2.12 dis minesi gorseli ilgili paragrafin altina tasindi
</commit_message>
<xml_diff>
--- a/Kim11-2-12-Asidik-Bazik-Urunler.docx
+++ b/Kim11-2-12-Asidik-Bazik-Urunler.docx
@@ -2363,7 +2363,7 @@
           <w:rFonts w:ascii="Times New Roman" w:hAnsi="Times New Roman" w:cs="Times New Roman"/>
           <w:lang w:val="tr-TR"/>
         </w:rPr>
-        <w:t xml:space="preserve">Diş ve ağız sağlığı: Diş minesi büyük ölçüde hidroksiapatit adı verilen kalsiyum fosfat yapılı bir mineralden oluşur. Şekerli besinler tüketildikten sonra ağızdaki bakteriler şekerleri parçalayarak asit üretir ve ağız içi pH değeri düşer. pH değeri yaklaşık 5,5’in altına indiğinde diş minesindeki minerallerin çözünmesi belirgin biçimde hızlanır; minenin mineral kaybetmesine demineralizasyon denir. Tükürük, içerdiği hidrojen karbonat (HCO</w:t>
+        <w:t xml:space="preserve">Diş ve ağız sağlığı: Diş minesi büyük ölçüde hidroksiapatit adı verilen kalsiyum fosfat yapılı bir mineralden oluşur. Şekerli besinler tüketildikten sonra ağızdaki bakteriler şekerleri parçalayarak asit üretir ve ağız içi pH değeri düşer. pH değeri yaklaşık 5,5’in altına indiğinde diş minesindeki minerallerin çözünmesi belirgin biçimde hızlanır; minenin mineral kaybetmesine demineralizasyon denir (Görsel C). Tükürük, içerdiği hidrojen karbonat (HCO</w:t>
       </w:r>
       <w:r>
         <w:rPr>
@@ -2387,169 +2387,6 @@
           <w:lang w:val="tr-TR"/>
         </w:rPr>
         <w:t xml:space="preserve">) gibi bazik özellik gösteren iyonlar sayesinde asitleri nötralleştirerek pH’ı yeniden yükseltir ve içerdiği kalsiyum ve fosfat iyonlarıyla minenin onarımına (remineralizasyon) yardımcı olur. Gece uykuda tükürük salgısı azaldığı için ağızda asidik ortam daha uzun süre kalabilir. Bu nedenle yatmadan önce dişlerin fırçalanması ve gece şekerli yiyecek-içecek tüketilmemesi önemlidir. Bir diş macununun koruyuculuğu yalnızca pH değerine bağlı değildir. Diş macunlarındaki florür, mineyi asitlere karşı daha dirençli hâle getirir; macunun aşındırıcılığı ve ağızda kalma süresi de koruyuculuğu etkiler. Çok bazik ürünler ise ağız içindeki yumuşak dokuları tahriş edebilir.</w:t>
-      </w:r>
-    </w:p>
-    <w:p>
-      <w:pPr>
-        <w:jc w:val="both"/>
-        <w:rPr>
-          <w:rFonts w:ascii="Times New Roman" w:hAnsi="Times New Roman" w:cs="Times New Roman"/>
-          <w:lang w:val="tr-TR"/>
-        </w:rPr>
-      </w:pPr>
-      <w:r>
-        <w:rPr>
-          <w:rFonts w:ascii="Times New Roman" w:hAnsi="Times New Roman" w:cs="Times New Roman"/>
-          <w:lang w:val="tr-TR"/>
-        </w:rPr>
-        <w:t xml:space="preserve">Mide sağlığı: Mide öz suyundaki hidroklorik asit, besinlerin sindirimine yardımcı olur ve besinlerle gelen mikroorganizmaların bir kısmını etkisiz hâle getirir. Mide asidinin fazla salgılanması mide ekşimesi ve yanmaya neden olabilir. Antasit adı verilen mide ilaçları magnezyum hidroksit (Mg(OH)</w:t>
-      </w:r>
-      <w:r>
-        <w:rPr>
-          <w:rFonts w:ascii="Times New Roman" w:hAnsi="Times New Roman" w:cs="Times New Roman"/>
-          <w:lang w:val="tr-TR"/>
-          <w:vertAlign w:val="subscript"/>
-        </w:rPr>
-        <w:t xml:space="preserve">2</w:t>
-      </w:r>
-      <w:r>
-        <w:rPr>
-          <w:rFonts w:ascii="Times New Roman" w:hAnsi="Times New Roman" w:cs="Times New Roman"/>
-          <w:lang w:val="tr-TR"/>
-        </w:rPr>
-        <w:t xml:space="preserve">), alüminyum hidroksit (Al(OH)</w:t>
-      </w:r>
-      <w:r>
-        <w:rPr>
-          <w:rFonts w:ascii="Times New Roman" w:hAnsi="Times New Roman" w:cs="Times New Roman"/>
-          <w:lang w:val="tr-TR"/>
-          <w:vertAlign w:val="subscript"/>
-        </w:rPr>
-        <w:t xml:space="preserve">3</w:t>
-      </w:r>
-      <w:r>
-        <w:rPr>
-          <w:rFonts w:ascii="Times New Roman" w:hAnsi="Times New Roman" w:cs="Times New Roman"/>
-          <w:lang w:val="tr-TR"/>
-        </w:rPr>
-        <w:t xml:space="preserve">) veya kalsiyum karbonat (CaCO</w:t>
-      </w:r>
-      <w:r>
-        <w:rPr>
-          <w:rFonts w:ascii="Times New Roman" w:hAnsi="Times New Roman" w:cs="Times New Roman"/>
-          <w:lang w:val="tr-TR"/>
-          <w:vertAlign w:val="subscript"/>
-        </w:rPr>
-        <w:t xml:space="preserve">3</w:t>
-      </w:r>
-      <w:r>
-        <w:rPr>
-          <w:rFonts w:ascii="Times New Roman" w:hAnsi="Times New Roman" w:cs="Times New Roman"/>
-          <w:lang w:val="tr-TR"/>
-        </w:rPr>
-        <w:t xml:space="preserve">) gibi bazik maddeler içerir ve fazla asidi nötralleştirir:</w:t>
-      </w:r>
-    </w:p>
-    <w:p>
-      <w:pPr>
-        <w:jc w:val="center"/>
-        <w:rPr>
-          <w:rFonts w:ascii="Times New Roman" w:hAnsi="Times New Roman" w:cs="Times New Roman"/>
-          <w:lang w:val="tr-TR"/>
-        </w:rPr>
-      </w:pPr>
-      <w:r>
-        <w:rPr>
-          <w:rFonts w:ascii="Times New Roman" w:hAnsi="Times New Roman" w:cs="Times New Roman"/>
-          <w:lang w:val="tr-TR"/>
-        </w:rPr>
-        <w:t xml:space="preserve">Mg(OH)</w:t>
-      </w:r>
-      <w:r>
-        <w:rPr>
-          <w:rFonts w:ascii="Times New Roman" w:hAnsi="Times New Roman" w:cs="Times New Roman"/>
-          <w:vertAlign w:val="subscript"/>
-          <w:lang w:val="tr-TR"/>
-        </w:rPr>
-        <w:t xml:space="preserve">2</w:t>
-      </w:r>
-      <w:r>
-        <w:rPr>
-          <w:rFonts w:ascii="Times New Roman" w:hAnsi="Times New Roman" w:cs="Times New Roman"/>
-          <w:lang w:val="tr-TR"/>
-        </w:rPr>
-        <w:t xml:space="preserve">(k) + 2HCl(suda) → MgCl</w:t>
-      </w:r>
-      <w:r>
-        <w:rPr>
-          <w:rFonts w:ascii="Times New Roman" w:hAnsi="Times New Roman" w:cs="Times New Roman"/>
-          <w:vertAlign w:val="subscript"/>
-          <w:lang w:val="tr-TR"/>
-        </w:rPr>
-        <w:t xml:space="preserve">2</w:t>
-      </w:r>
-      <w:r>
-        <w:rPr>
-          <w:rFonts w:ascii="Times New Roman" w:hAnsi="Times New Roman" w:cs="Times New Roman"/>
-          <w:lang w:val="tr-TR"/>
-        </w:rPr>
-        <w:t xml:space="preserve">(suda) + 2H</w:t>
-      </w:r>
-      <w:r>
-        <w:rPr>
-          <w:rFonts w:ascii="Times New Roman" w:hAnsi="Times New Roman" w:cs="Times New Roman"/>
-          <w:vertAlign w:val="subscript"/>
-          <w:lang w:val="tr-TR"/>
-        </w:rPr>
-        <w:t xml:space="preserve">2</w:t>
-      </w:r>
-      <w:r>
-        <w:rPr>
-          <w:rFonts w:ascii="Times New Roman" w:hAnsi="Times New Roman" w:cs="Times New Roman"/>
-          <w:lang w:val="tr-TR"/>
-        </w:rPr>
-        <w:t xml:space="preserve">O(s)</w:t>
-      </w:r>
-    </w:p>
-    <w:p>
-      <w:pPr>
-        <w:jc w:val="both"/>
-        <w:rPr>
-          <w:rFonts w:ascii="Times New Roman" w:hAnsi="Times New Roman" w:cs="Times New Roman"/>
-          <w:lang w:val="tr-TR"/>
-        </w:rPr>
-      </w:pPr>
-      <w:r>
-        <w:rPr>
-          <w:rFonts w:ascii="Times New Roman" w:hAnsi="Times New Roman" w:cs="Times New Roman"/>
-          <w:lang w:val="tr-TR"/>
-        </w:rPr>
-        <w:t xml:space="preserve">Proton pompası inhibitörleri gibi bazı mide ilaçları ise asidi nötralleştirmek yerine mide hücrelerinin HCl salgılamasını azaltır. İlaçlar mutlaka hekim önerisiyle ve önerilen sürede kullanılmalıdır. Gazlı içecekler, asitli meyve suları ve aşırı baharatlı yiyecekler mide rahatsızlığı olan kişilerde şikâyetleri artırabilir.</w:t>
-      </w:r>
-    </w:p>
-    <w:p>
-      <w:pPr>
-        <w:jc w:val="both"/>
-        <w:rPr>
-          <w:rFonts w:ascii="Times New Roman" w:hAnsi="Times New Roman" w:cs="Times New Roman"/>
-          <w:lang w:val="tr-TR"/>
-        </w:rPr>
-      </w:pPr>
-      <w:r>
-        <w:rPr>
-          <w:rFonts w:ascii="Times New Roman" w:hAnsi="Times New Roman" w:cs="Times New Roman"/>
-          <w:b/>
-          <w:bCs/>
-          <w:lang w:val="tr-TR"/>
-        </w:rPr>
-        <w:t xml:space="preserve">Cilt sağlığı:</w:t>
-      </w:r>
-      <w:r>
-        <w:rPr>
-          <w:rFonts w:ascii="Times New Roman" w:hAnsi="Times New Roman" w:cs="Times New Roman"/>
-          <w:lang w:val="tr-TR"/>
-        </w:rPr>
-        <w:t xml:space="preserve"> Cilt yüzeyi hafif asidik bir tabaka ile kaplıdır. Bu asidik tabaka cildi bazı mikroorganizmalara karşı korur ve cildin nem dengesinin korunmasına yardımcı olur. Geleneksel kalıp sabunlar genellikle baziktir (pH yaklaşık 9-10) ve kullanıldıktan sonra cildin pH değerini geçici olarak yükseltebilir. Hassas ve kuru ciltler için pH değeri cildin doğal pH’ına yakın olan temizleyiciler tercih edilebilir. Cilt bakım ürünleri seçilirken cilt tipi, ürünün içeriği ve kullanım amacı birlikte değerlendirilmelidir.</w:t>
       </w:r>
     </w:p>
     <w:tbl>
@@ -2655,6 +2492,169 @@
           <w:lang w:val="tr-TR"/>
         </w:rPr>
         <w:t xml:space="preserve"> Diş minesi ve asit etkisi</w:t>
+      </w:r>
+    </w:p>
+    <w:p>
+      <w:pPr>
+        <w:jc w:val="both"/>
+        <w:rPr>
+          <w:rFonts w:ascii="Times New Roman" w:hAnsi="Times New Roman" w:cs="Times New Roman"/>
+          <w:lang w:val="tr-TR"/>
+        </w:rPr>
+      </w:pPr>
+      <w:r>
+        <w:rPr>
+          <w:rFonts w:ascii="Times New Roman" w:hAnsi="Times New Roman" w:cs="Times New Roman"/>
+          <w:lang w:val="tr-TR"/>
+        </w:rPr>
+        <w:t xml:space="preserve">Mide sağlığı: Mide öz suyundaki hidroklorik asit, besinlerin sindirimine yardımcı olur ve besinlerle gelen mikroorganizmaların bir kısmını etkisiz hâle getirir. Mide asidinin fazla salgılanması mide ekşimesi ve yanmaya neden olabilir. Antasit adı verilen mide ilaçları magnezyum hidroksit (Mg(OH)</w:t>
+      </w:r>
+      <w:r>
+        <w:rPr>
+          <w:rFonts w:ascii="Times New Roman" w:hAnsi="Times New Roman" w:cs="Times New Roman"/>
+          <w:lang w:val="tr-TR"/>
+          <w:vertAlign w:val="subscript"/>
+        </w:rPr>
+        <w:t xml:space="preserve">2</w:t>
+      </w:r>
+      <w:r>
+        <w:rPr>
+          <w:rFonts w:ascii="Times New Roman" w:hAnsi="Times New Roman" w:cs="Times New Roman"/>
+          <w:lang w:val="tr-TR"/>
+        </w:rPr>
+        <w:t xml:space="preserve">), alüminyum hidroksit (Al(OH)</w:t>
+      </w:r>
+      <w:r>
+        <w:rPr>
+          <w:rFonts w:ascii="Times New Roman" w:hAnsi="Times New Roman" w:cs="Times New Roman"/>
+          <w:lang w:val="tr-TR"/>
+          <w:vertAlign w:val="subscript"/>
+        </w:rPr>
+        <w:t xml:space="preserve">3</w:t>
+      </w:r>
+      <w:r>
+        <w:rPr>
+          <w:rFonts w:ascii="Times New Roman" w:hAnsi="Times New Roman" w:cs="Times New Roman"/>
+          <w:lang w:val="tr-TR"/>
+        </w:rPr>
+        <w:t xml:space="preserve">) veya kalsiyum karbonat (CaCO</w:t>
+      </w:r>
+      <w:r>
+        <w:rPr>
+          <w:rFonts w:ascii="Times New Roman" w:hAnsi="Times New Roman" w:cs="Times New Roman"/>
+          <w:lang w:val="tr-TR"/>
+          <w:vertAlign w:val="subscript"/>
+        </w:rPr>
+        <w:t xml:space="preserve">3</w:t>
+      </w:r>
+      <w:r>
+        <w:rPr>
+          <w:rFonts w:ascii="Times New Roman" w:hAnsi="Times New Roman" w:cs="Times New Roman"/>
+          <w:lang w:val="tr-TR"/>
+        </w:rPr>
+        <w:t xml:space="preserve">) gibi bazik maddeler içerir ve fazla asidi nötralleştirir:</w:t>
+      </w:r>
+    </w:p>
+    <w:p>
+      <w:pPr>
+        <w:jc w:val="center"/>
+        <w:rPr>
+          <w:rFonts w:ascii="Times New Roman" w:hAnsi="Times New Roman" w:cs="Times New Roman"/>
+          <w:lang w:val="tr-TR"/>
+        </w:rPr>
+      </w:pPr>
+      <w:r>
+        <w:rPr>
+          <w:rFonts w:ascii="Times New Roman" w:hAnsi="Times New Roman" w:cs="Times New Roman"/>
+          <w:lang w:val="tr-TR"/>
+        </w:rPr>
+        <w:t xml:space="preserve">Mg(OH)</w:t>
+      </w:r>
+      <w:r>
+        <w:rPr>
+          <w:rFonts w:ascii="Times New Roman" w:hAnsi="Times New Roman" w:cs="Times New Roman"/>
+          <w:vertAlign w:val="subscript"/>
+          <w:lang w:val="tr-TR"/>
+        </w:rPr>
+        <w:t xml:space="preserve">2</w:t>
+      </w:r>
+      <w:r>
+        <w:rPr>
+          <w:rFonts w:ascii="Times New Roman" w:hAnsi="Times New Roman" w:cs="Times New Roman"/>
+          <w:lang w:val="tr-TR"/>
+        </w:rPr>
+        <w:t xml:space="preserve">(k) + 2HCl(suda) → MgCl</w:t>
+      </w:r>
+      <w:r>
+        <w:rPr>
+          <w:rFonts w:ascii="Times New Roman" w:hAnsi="Times New Roman" w:cs="Times New Roman"/>
+          <w:vertAlign w:val="subscript"/>
+          <w:lang w:val="tr-TR"/>
+        </w:rPr>
+        <w:t xml:space="preserve">2</w:t>
+      </w:r>
+      <w:r>
+        <w:rPr>
+          <w:rFonts w:ascii="Times New Roman" w:hAnsi="Times New Roman" w:cs="Times New Roman"/>
+          <w:lang w:val="tr-TR"/>
+        </w:rPr>
+        <w:t xml:space="preserve">(suda) + 2H</w:t>
+      </w:r>
+      <w:r>
+        <w:rPr>
+          <w:rFonts w:ascii="Times New Roman" w:hAnsi="Times New Roman" w:cs="Times New Roman"/>
+          <w:vertAlign w:val="subscript"/>
+          <w:lang w:val="tr-TR"/>
+        </w:rPr>
+        <w:t xml:space="preserve">2</w:t>
+      </w:r>
+      <w:r>
+        <w:rPr>
+          <w:rFonts w:ascii="Times New Roman" w:hAnsi="Times New Roman" w:cs="Times New Roman"/>
+          <w:lang w:val="tr-TR"/>
+        </w:rPr>
+        <w:t xml:space="preserve">O(s)</w:t>
+      </w:r>
+    </w:p>
+    <w:p>
+      <w:pPr>
+        <w:jc w:val="both"/>
+        <w:rPr>
+          <w:rFonts w:ascii="Times New Roman" w:hAnsi="Times New Roman" w:cs="Times New Roman"/>
+          <w:lang w:val="tr-TR"/>
+        </w:rPr>
+      </w:pPr>
+      <w:r>
+        <w:rPr>
+          <w:rFonts w:ascii="Times New Roman" w:hAnsi="Times New Roman" w:cs="Times New Roman"/>
+          <w:lang w:val="tr-TR"/>
+        </w:rPr>
+        <w:t xml:space="preserve">Proton pompası inhibitörleri gibi bazı mide ilaçları ise asidi nötralleştirmek yerine mide hücrelerinin HCl salgılamasını azaltır. İlaçlar mutlaka hekim önerisiyle ve önerilen sürede kullanılmalıdır. Gazlı içecekler, asitli meyve suları ve aşırı baharatlı yiyecekler mide rahatsızlığı olan kişilerde şikâyetleri artırabilir.</w:t>
+      </w:r>
+    </w:p>
+    <w:p>
+      <w:pPr>
+        <w:jc w:val="both"/>
+        <w:rPr>
+          <w:rFonts w:ascii="Times New Roman" w:hAnsi="Times New Roman" w:cs="Times New Roman"/>
+          <w:lang w:val="tr-TR"/>
+        </w:rPr>
+      </w:pPr>
+      <w:r>
+        <w:rPr>
+          <w:rFonts w:ascii="Times New Roman" w:hAnsi="Times New Roman" w:cs="Times New Roman"/>
+          <w:b/>
+          <w:bCs/>
+          <w:lang w:val="tr-TR"/>
+        </w:rPr>
+        <w:t xml:space="preserve">Cilt sağlığı:</w:t>
+      </w:r>
+      <w:r>
+        <w:rPr>
+          <w:rFonts w:ascii="Times New Roman" w:hAnsi="Times New Roman" w:cs="Times New Roman"/>
+          <w:lang w:val="tr-TR"/>
+        </w:rPr>
+        <w:t xml:space="preserve"> Cilt yüzeyi hafif asidik bir tabaka ile kaplıdır. Bu asidik tabaka cildi bazı mikroorganizmalara karşı korur ve cildin nem dengesinin korunmasına yardımcı olur. Geleneksel kalıp sabunlar genellikle baziktir (pH yaklaşık 9-10) ve kullanıldıktan sonra cildin pH değerini geçici olarak yükseltebilir. Hassas ve kuru ciltler için pH değeri cildin doğal pH’ına yakın olan temizleyiciler tercih edilebilir. Cilt bakım ürünleri seçilirken cilt tipi, ürünün içeriği ve kullanım amacı birlikte değerlendirilmelidir.</w:t>
       </w:r>
     </w:p>
     <w:p>

</xml_diff>

<commit_message>
Kim11-2-12-Asidik-Bazik-Urunler: gorsel alanlarina Shutter onizlemeleri yerlestirildi (2.3 bicimi)
</commit_message>
<xml_diff>
--- a/Kim11-2-12-Asidik-Bazik-Urunler.docx
+++ b/Kim11-2-12-Asidik-Bazik-Urunler.docx
@@ -62,77 +62,60 @@
           <w:tcPr>
             <w:tcW w:w="4500" w:type="dxa"/>
           </w:tcPr>
-          <w:tbl>
-            <w:tblPr>
-              <w:tblW w:w="4300" w:type="dxa"/>
+          <w:p>
+            <w:pPr>
               <w:jc w:val="center"/>
-              <w:tblBorders>
-                <w:top w:val="single" w:sz="8" w:space="0" w:color="7F7F7F"/>
-                <w:left w:val="single" w:sz="8" w:space="0" w:color="7F7F7F"/>
-                <w:bottom w:val="single" w:sz="8" w:space="0" w:color="7F7F7F"/>
-                <w:right w:val="single" w:sz="8" w:space="0" w:color="7F7F7F"/>
-              </w:tblBorders>
-            </w:tblPr>
-            <w:tblGrid>
-              <w:gridCol w:w="4300"/>
-            </w:tblGrid>
-            <w:tr>
-              <w:tc>
-                <w:tcPr>
-                  <w:tcW w:w="4300" w:type="dxa"/>
-                  <w:shd w:val="clear" w:color="auto" w:fill="EDEDED"/>
-                </w:tcPr>
-                <w:p>
-                  <w:pPr>
-                    <w:jc w:val="both"/>
-                    <w:rPr>
-                      <w:rFonts w:ascii="Times New Roman" w:hAnsi="Times New Roman" w:cs="Times New Roman"/>
-                      <w:lang w:val="tr-TR"/>
-                    </w:rPr>
-                  </w:pPr>
-                  <w:r>
-                    <w:rPr>
-                      <w:rFonts w:ascii="Times New Roman" w:hAnsi="Times New Roman" w:cs="Times New Roman"/>
-                      <w:lang w:val="tr-TR"/>
-                    </w:rPr>
-                    <w:t xml:space="preserve">GÖRSEL ALANI (Shutterstock)</w:t>
-                  </w:r>
-                </w:p>
-                <w:p>
-                  <w:pPr>
-                    <w:jc w:val="both"/>
-                    <w:rPr>
-                      <w:rFonts w:ascii="Times New Roman" w:hAnsi="Times New Roman" w:cs="Times New Roman"/>
-                      <w:lang w:val="tr-TR"/>
-                    </w:rPr>
-                  </w:pPr>
-                  <w:r>
-                    <w:rPr>
-                      <w:rFonts w:ascii="Times New Roman" w:hAnsi="Times New Roman" w:cs="Times New Roman"/>
-                      <w:lang w:val="tr-TR"/>
-                    </w:rPr>
-                    <w:t xml:space="preserve">Tarif: Banyo rafında diş fırçası, diş macunu tüpü, ağız çalkalama suyu şişesi ve sıvı sabun; ürünlerde marka/logo görünmesin.</w:t>
-                  </w:r>
-                </w:p>
-                <w:p>
-                  <w:pPr>
-                    <w:jc w:val="both"/>
-                    <w:rPr>
-                      <w:rFonts w:ascii="Times New Roman" w:hAnsi="Times New Roman" w:cs="Times New Roman"/>
-                      <w:lang w:val="tr-TR"/>
-                    </w:rPr>
-                  </w:pPr>
-                  <w:r>
-                    <w:rPr>
-                      <w:rFonts w:ascii="Times New Roman" w:hAnsi="Times New Roman" w:cs="Times New Roman"/>
-                      <w:lang w:val="tr-TR"/>
-                    </w:rPr>
-                    <w:t xml:space="preserve">Shutter ID: 2682398827 (fotoğraf) — Mouthwash, toothbrushes and toothpaste on bathroom shelf</w:t>
-                  </w:r>
-                </w:p>
-              </w:tc>
-            </w:tr>
-          </w:tbl>
+            </w:pPr>
+            <w:r>
+              <w:drawing>
+                <wp:inline xmlns:a="http://schemas.openxmlformats.org/drawingml/2006/main" xmlns:pic="http://schemas.openxmlformats.org/drawingml/2006/picture">
+                  <wp:extent cx="2664000" cy="1953600"/>
+                  <wp:docPr id="900008" name="Picture 900008"/>
+                  <wp:cNvGraphicFramePr>
+                    <a:graphicFrameLocks noChangeAspect="1"/>
+                  </wp:cNvGraphicFramePr>
+                  <a:graphic>
+                    <a:graphicData uri="http://schemas.openxmlformats.org/drawingml/2006/picture">
+                      <pic:pic>
+                        <pic:nvPicPr>
+                          <pic:cNvPr id="0" name="2682398827_d.jpg"/>
+                          <pic:cNvPicPr/>
+                        </pic:nvPicPr>
+                        <pic:blipFill>
+                          <a:blip r:embed="rId11"/>
+                          <a:stretch>
+                            <a:fillRect/>
+                          </a:stretch>
+                        </pic:blipFill>
+                        <pic:spPr>
+                          <a:xfrm>
+                            <a:off x="0" y="0"/>
+                            <a:ext cx="2664000" cy="1953600"/>
+                          </a:xfrm>
+                          <a:prstGeom prst="rect"/>
+                        </pic:spPr>
+                      </pic:pic>
+                    </a:graphicData>
+                  </a:graphic>
+                </wp:inline>
+              </w:drawing>
+            </w:r>
+          </w:p>
+          <w:p>
+            <w:pPr>
+              <w:jc w:val="center"/>
+            </w:pPr>
+            <w:r>
+              <w:rPr>
+                <w:rFonts w:ascii="Times New Roman" w:hAnsi="Times New Roman" w:cs="Times New Roman"/>
+                <w:b/>
+                <w:bCs/>
+                <w:highlight w:val="yellow"/>
+                <w:lang w:val="tr-TR"/>
+              </w:rPr>
+              <w:t xml:space="preserve">Shutter id: 2682398827</w:t>
+            </w:r>
+          </w:p>
           <w:p>
             <w:pPr>
               <w:jc w:val="center"/>
@@ -163,77 +146,60 @@
           <w:tcPr>
             <w:tcW w:w="4500" w:type="dxa"/>
           </w:tcPr>
-          <w:tbl>
-            <w:tblPr>
-              <w:tblW w:w="4300" w:type="dxa"/>
+          <w:p>
+            <w:pPr>
               <w:jc w:val="center"/>
-              <w:tblBorders>
-                <w:top w:val="single" w:sz="8" w:space="0" w:color="7F7F7F"/>
-                <w:left w:val="single" w:sz="8" w:space="0" w:color="7F7F7F"/>
-                <w:bottom w:val="single" w:sz="8" w:space="0" w:color="7F7F7F"/>
-                <w:right w:val="single" w:sz="8" w:space="0" w:color="7F7F7F"/>
-              </w:tblBorders>
-            </w:tblPr>
-            <w:tblGrid>
-              <w:gridCol w:w="4300"/>
-            </w:tblGrid>
-            <w:tr>
-              <w:tc>
-                <w:tcPr>
-                  <w:tcW w:w="4300" w:type="dxa"/>
-                  <w:shd w:val="clear" w:color="auto" w:fill="EDEDED"/>
-                </w:tcPr>
-                <w:p>
-                  <w:pPr>
-                    <w:jc w:val="both"/>
-                    <w:rPr>
-                      <w:rFonts w:ascii="Times New Roman" w:hAnsi="Times New Roman" w:cs="Times New Roman"/>
-                      <w:lang w:val="tr-TR"/>
-                    </w:rPr>
-                  </w:pPr>
-                  <w:r>
-                    <w:rPr>
-                      <w:rFonts w:ascii="Times New Roman" w:hAnsi="Times New Roman" w:cs="Times New Roman"/>
-                      <w:lang w:val="tr-TR"/>
-                    </w:rPr>
-                    <w:t xml:space="preserve">GÖRSEL ALANI (Shutterstock)</w:t>
-                  </w:r>
-                </w:p>
-                <w:p>
-                  <w:pPr>
-                    <w:jc w:val="both"/>
-                    <w:rPr>
-                      <w:rFonts w:ascii="Times New Roman" w:hAnsi="Times New Roman" w:cs="Times New Roman"/>
-                      <w:lang w:val="tr-TR"/>
-                    </w:rPr>
-                  </w:pPr>
-                  <w:r>
-                    <w:rPr>
-                      <w:rFonts w:ascii="Times New Roman" w:hAnsi="Times New Roman" w:cs="Times New Roman"/>
-                      <w:lang w:val="tr-TR"/>
-                    </w:rPr>
-                    <w:t xml:space="preserve">Tarif: Bardakta taze sıkılmış portakal suyu ve yanında portakallar.</w:t>
-                  </w:r>
-                </w:p>
-                <w:p>
-                  <w:pPr>
-                    <w:jc w:val="both"/>
-                    <w:rPr>
-                      <w:rFonts w:ascii="Times New Roman" w:hAnsi="Times New Roman" w:cs="Times New Roman"/>
-                      <w:lang w:val="tr-TR"/>
-                    </w:rPr>
-                  </w:pPr>
-                  <w:r>
-                    <w:rPr>
-                      <w:rFonts w:ascii="Times New Roman" w:hAnsi="Times New Roman" w:cs="Times New Roman"/>
-                      <w:lang w:val="tr-TR"/>
-                    </w:rPr>
-                    <w:t xml:space="preserve">Shutter ID: 2820267205 (fotoğraf) — Juicy oranges and freshly squeezed juice in a glass</w:t>
-                  </w:r>
-                </w:p>
-              </w:tc>
-            </w:tr>
-          </w:tbl>
+            </w:pPr>
+            <w:r>
+              <w:drawing>
+                <wp:inline xmlns:a="http://schemas.openxmlformats.org/drawingml/2006/main" xmlns:pic="http://schemas.openxmlformats.org/drawingml/2006/picture">
+                  <wp:extent cx="2360890" cy="1980000"/>
+                  <wp:docPr id="900009" name="Picture 900009"/>
+                  <wp:cNvGraphicFramePr>
+                    <a:graphicFrameLocks noChangeAspect="1"/>
+                  </wp:cNvGraphicFramePr>
+                  <a:graphic>
+                    <a:graphicData uri="http://schemas.openxmlformats.org/drawingml/2006/picture">
+                      <pic:pic>
+                        <pic:nvPicPr>
+                          <pic:cNvPr id="0" name="2820267205_d.jpg"/>
+                          <pic:cNvPicPr/>
+                        </pic:nvPicPr>
+                        <pic:blipFill>
+                          <a:blip r:embed="rId12"/>
+                          <a:stretch>
+                            <a:fillRect/>
+                          </a:stretch>
+                        </pic:blipFill>
+                        <pic:spPr>
+                          <a:xfrm>
+                            <a:off x="0" y="0"/>
+                            <a:ext cx="2360890" cy="1980000"/>
+                          </a:xfrm>
+                          <a:prstGeom prst="rect"/>
+                        </pic:spPr>
+                      </pic:pic>
+                    </a:graphicData>
+                  </a:graphic>
+                </wp:inline>
+              </w:drawing>
+            </w:r>
+          </w:p>
+          <w:p>
+            <w:pPr>
+              <w:jc w:val="center"/>
+            </w:pPr>
+            <w:r>
+              <w:rPr>
+                <w:rFonts w:ascii="Times New Roman" w:hAnsi="Times New Roman" w:cs="Times New Roman"/>
+                <w:b/>
+                <w:bCs/>
+                <w:highlight w:val="yellow"/>
+                <w:lang w:val="tr-TR"/>
+              </w:rPr>
+              <w:t xml:space="preserve">Shutter id: 2820267205</w:t>
+            </w:r>
+          </w:p>
           <w:p>
             <w:pPr>
               <w:jc w:val="center"/>
@@ -2389,85 +2355,59 @@
         <w:t xml:space="preserve">) gibi bazik özellik gösteren iyonlar sayesinde asitleri nötralleştirerek pH’ı yeniden yükseltir ve içerdiği kalsiyum ve fosfat iyonlarıyla minenin onarımına (remineralizasyon) yardımcı olur. Gece uykuda tükürük salgısı azaldığı için ağızda asidik ortam daha uzun süre kalabilir. Bu nedenle yatmadan önce dişlerin fırçalanması ve gece şekerli yiyecek-içecek tüketilmemesi önemlidir. Bir diş macununun koruyuculuğu yalnızca pH değerine bağlı değildir. Diş macunlarındaki florür, mineyi asitlere karşı daha dirençli hâle getirir; macunun aşındırıcılığı ve ağızda kalma süresi de koruyuculuğu etkiler. Çok bazik ürünler ise ağız içindeki yumuşak dokuları tahriş edebilir.</w:t>
       </w:r>
     </w:p>
-    <w:tbl>
-      <w:tblPr>
-        <w:tblW w:w="9000" w:type="dxa"/>
+    <w:p>
+      <w:pPr>
         <w:jc w:val="center"/>
-        <w:tblBorders>
-          <w:top w:val="single" w:sz="8" w:space="0" w:color="7F7F7F"/>
-          <w:left w:val="single" w:sz="8" w:space="0" w:color="7F7F7F"/>
-          <w:bottom w:val="single" w:sz="8" w:space="0" w:color="7F7F7F"/>
-          <w:right w:val="single" w:sz="8" w:space="0" w:color="7F7F7F"/>
-        </w:tblBorders>
-      </w:tblPr>
-      <w:tblGrid>
-        <w:gridCol w:w="9000"/>
-      </w:tblGrid>
-      <w:tr>
-        <w:tc>
-          <w:tcPr>
-            <w:tcW w:w="9000" w:type="dxa"/>
-            <w:shd w:val="clear" w:color="auto" w:fill="EDEDED"/>
-          </w:tcPr>
-          <w:p>
-            <w:pPr>
-              <w:jc w:val="both"/>
-              <w:rPr>
-                <w:rFonts w:ascii="Times New Roman" w:hAnsi="Times New Roman" w:cs="Times New Roman"/>
-                <w:lang w:val="tr-TR"/>
-              </w:rPr>
-            </w:pPr>
-            <w:r>
-              <w:rPr>
-                <w:rFonts w:ascii="Times New Roman" w:hAnsi="Times New Roman" w:cs="Times New Roman"/>
-                <w:lang w:val="tr-TR"/>
-              </w:rPr>
-              <w:t xml:space="preserve">GÖRSEL ALANI (Shutterstock)</w:t>
-            </w:r>
-          </w:p>
-          <w:p>
-            <w:pPr>
-              <w:jc w:val="both"/>
-              <w:rPr>
-                <w:rFonts w:ascii="Times New Roman" w:hAnsi="Times New Roman" w:cs="Times New Roman"/>
-                <w:lang w:val="tr-TR"/>
-              </w:rPr>
-            </w:pPr>
-            <w:r>
-              <w:rPr>
-                <w:rFonts w:ascii="Times New Roman" w:hAnsi="Times New Roman" w:cs="Times New Roman"/>
-                <w:lang w:val="tr-TR"/>
-              </w:rPr>
-              <w:t xml:space="preserve">Tarif: Sağlıklı diş minesi ile asit etkisiyle yüzeyi aşınmış (demineralize) diş minesini karşılaştıran vektörel kesit çizimi.</w:t>
-            </w:r>
-          </w:p>
-          <w:p>
-            <w:pPr>
-              <w:jc w:val="both"/>
-              <w:rPr>
-                <w:rFonts w:ascii="Times New Roman" w:hAnsi="Times New Roman" w:cs="Times New Roman"/>
-                <w:lang w:val="tr-TR"/>
-              </w:rPr>
-            </w:pPr>
-            <w:r>
-              <w:rPr>
-                <w:rFonts w:ascii="Times New Roman" w:hAnsi="Times New Roman" w:cs="Times New Roman"/>
-                <w:lang w:val="tr-TR"/>
-              </w:rPr>
-              <w:t xml:space="preserve">Shutter ID: 2720078127 (vektör) — Tooth demineralization process</w:t>
-            </w:r>
-          </w:p>
-        </w:tc>
-      </w:tr>
-    </w:tbl>
-    <w:p>
-      <w:pPr>
-        <w:jc w:val="both"/>
-        <w:rPr>
-          <w:rFonts w:ascii="Times New Roman" w:hAnsi="Times New Roman" w:cs="Times New Roman"/>
-          <w:lang w:val="tr-TR"/>
-        </w:rPr>
-      </w:pPr>
+      </w:pPr>
+      <w:r>
+        <w:drawing>
+          <wp:inline xmlns:a="http://schemas.openxmlformats.org/drawingml/2006/main" xmlns:pic="http://schemas.openxmlformats.org/drawingml/2006/picture">
+            <wp:extent cx="2112075" cy="2520000"/>
+            <wp:docPr id="900010" name="Picture 900010"/>
+            <wp:cNvGraphicFramePr>
+              <a:graphicFrameLocks noChangeAspect="1"/>
+            </wp:cNvGraphicFramePr>
+            <a:graphic>
+              <a:graphicData uri="http://schemas.openxmlformats.org/drawingml/2006/picture">
+                <pic:pic>
+                  <pic:nvPicPr>
+                    <pic:cNvPr id="0" name="2720078127_d.jpg"/>
+                    <pic:cNvPicPr/>
+                  </pic:nvPicPr>
+                  <pic:blipFill>
+                    <a:blip r:embed="rId13"/>
+                    <a:stretch>
+                      <a:fillRect/>
+                    </a:stretch>
+                  </pic:blipFill>
+                  <pic:spPr>
+                    <a:xfrm>
+                      <a:off x="0" y="0"/>
+                      <a:ext cx="2112075" cy="2520000"/>
+                    </a:xfrm>
+                    <a:prstGeom prst="rect"/>
+                  </pic:spPr>
+                </pic:pic>
+              </a:graphicData>
+            </a:graphic>
+          </wp:inline>
+        </w:drawing>
+      </w:r>
+    </w:p>
+    <w:p>
+      <w:pPr>
+        <w:jc w:val="center"/>
+      </w:pPr>
+      <w:r>
+        <w:rPr>
+          <w:rFonts w:ascii="Times New Roman" w:hAnsi="Times New Roman" w:cs="Times New Roman"/>
+          <w:b/>
+          <w:bCs/>
+          <w:highlight w:val="yellow"/>
+          <w:lang w:val="tr-TR"/>
+        </w:rPr>
+        <w:t xml:space="preserve">Shutter id: 2720078127</w:t>
+      </w:r>
     </w:p>
     <w:p>
       <w:pPr>

</xml_diff>

<commit_message>
Ingilizce yazi iceren gorsellere (2.12, 3.1, 3.2, dijital tema 2-3) Turkce karsiliklar sari NOT olarak eklendi
</commit_message>
<xml_diff>
--- a/Kim11-2-12-Asidik-Bazik-Urunler.docx
+++ b/Kim11-2-12-Asidik-Bazik-Urunler.docx
@@ -2407,6 +2407,26 @@
           <w:lang w:val="tr-TR"/>
         </w:rPr>
         <w:t xml:space="preserve">Shutter id: 2720078127</w:t>
+      </w:r>
+    </w:p>
+    <w:p>
+      <w:r>
+        <w:rPr>
+          <w:rFonts w:ascii="Times New Roman" w:hAnsi="Times New Roman" w:cs="Times New Roman"/>
+          <w:b/>
+          <w:highlight w:val="yellow"/>
+          <w:lang w:val="tr-TR"/>
+        </w:rPr>
+        <w:t xml:space="preserve">NOT: </w:t>
+      </w:r>
+      <w:r>
+        <w:rPr>
+          <w:rFonts w:ascii="Times New Roman" w:hAnsi="Times New Roman" w:cs="Times New Roman"/>
+          <w:b w:val="0"/>
+          <w:highlight w:val="yellow"/>
+          <w:lang w:val="tr-TR"/>
+        </w:rPr>
+        <w:t>Görseldeki İngilizce yazılar Türkçeye çevrilecek: Demineralization: Demineralizasyon; Cariogenic Biofilm and Bacteria (görselde yanlış olarak “Carlogenic” yazılmış): Çürük yapıcı biyofilm ve bakteriler; Acid: Asit; Ion discharge: İyon kaybı. İyon formülleri (Ca²⁺, PO₄³⁻, CO₃²⁻) aynen kalır.</w:t>
       </w:r>
     </w:p>
     <w:p>

</xml_diff>

<commit_message>
2.12: agiz ici pH grafigi Grafik A olarak adlandirildi, (temsili) ifadesi kaldirildi
</commit_message>
<xml_diff>
--- a/Kim11-2-12-Asidik-Bazik-Urunler.docx
+++ b/Kim11-2-12-Asidik-Bazik-Urunler.docx
@@ -2404,7 +2404,7 @@
           <w:rFonts w:ascii="Times New Roman" w:hAnsi="Times New Roman" w:cs="Times New Roman"/>
           <w:lang w:val="tr-TR"/>
         </w:rPr>
-        <w:t>Diş ve ağız sağlığı: Diş minesi büyük ölçüde hidroksiapatit adı verilen kalsiyum fosfat yapılı bir mineralden oluşur. Şekerli besinler tüketildikten sonra ağızdaki bakteriler şekerleri parçalayarak asit üretir ve ağız içi pH değeri düşer (Görsel D). pH değeri yaklaşık 5,5’in altına indiğinde diş minesindeki minerallerin çözünmesi belirgin biçimde hızlanır; minenin mineral kaybetmesine demineralizasyon denir (Görsel C). Tükürük, içerdiği hidrojen karbonat (HCO</w:t>
+        <w:t>Diş ve ağız sağlığı: Diş minesi büyük ölçüde hidroksiapatit adı verilen kalsiyum fosfat yapılı bir mineralden oluşur. Şekerli besinler tüketildikten sonra ağızdaki bakteriler şekerleri parçalayarak asit üretir ve ağız içi pH değeri düşer (Grafik A). pH değeri yaklaşık 5,5’in altına indiğinde diş minesindeki minerallerin çözünmesi belirgin biçimde hızlanır; minenin mineral kaybetmesine demineralizasyon denir (Görsel C). Tükürük, içerdiği hidrojen karbonat (HCO</w:t>
       </w:r>
       <w:r>
         <w:rPr>
@@ -2628,14 +2628,14 @@
                 <w:bCs/>
                 <w:lang w:val="tr-TR"/>
               </w:rPr>
-              <w:t>Görsel D:</w:t>
+              <w:t>Grafik A:</w:t>
             </w:r>
             <w:r>
               <w:rPr>
                 <w:rFonts w:ascii="Times New Roman" w:hAnsi="Times New Roman" w:cs="Times New Roman"/>
                 <w:lang w:val="tr-TR"/>
               </w:rPr>
-              <w:t xml:space="preserve"> Şekerli besin tüketildikten sonra ağız içi pH değerinin zamanla değişimi (temsilî)</w:t>
+              <w:t xml:space="preserve"> Şekerli besin tüketildikten sonra ağız içi pH değerinin zamanla değişimi</w:t>
             </w:r>
           </w:p>
         </w:tc>

</xml_diff>